<commit_message>
Deploy preview for PR 563 🛫
</commit_message>
<xml_diff>
--- a/pr-preview/pr-563/UCD-SeRG-Lab-Manual-tracked-changes.docx
+++ b/pr-preview/pr-563/UCD-SeRG-Lab-Manual-tracked-changes.docx
@@ -28720,7 +28720,7 @@
       </w:ins>
       <w:ins w:id="989" w:author="PR Preview" w:date="2024-01-01T00:00:00Z">
         <w:r>
-          <w:t xml:space="preserve">959b81f</w:t>
+          <w:t xml:space="preserve">94cbc7c</w:t>
         </w:r>
       </w:ins>
     </w:p>
@@ -28748,7 +28748,7 @@
       </w:ins>
       <w:ins w:id="990" w:author="PR Preview" w:date="2024-01-01T00:00:00Z">
         <w:r>
-          <w:t xml:space="preserve">959b81fe0ba8b0d7318cb9087722c6037ef090ac</w:t>
+          <w:t xml:space="preserve">94cbc7c879166574b80f406b616168464159e867</w:t>
         </w:r>
       </w:ins>
     </w:p>
@@ -28776,7 +28776,7 @@
       </w:ins>
       <w:ins w:id="991" w:author="PR Preview" w:date="2024-01-01T00:00:00Z">
         <w:r>
-          <w:t xml:space="preserve">2026-10-15 06:39:26 +0000</w:t>
+          <w:t xml:space="preserve">2026-10-15 07:11:21 +0000</w:t>
         </w:r>
       </w:ins>
     </w:p>

</xml_diff>